<commit_message>
Touching up for journal of ethnic and migration studies
</commit_message>
<xml_diff>
--- a/writings/Finding_a_Job/Titlepage_abstract_keywords.docx
+++ b/writings/Finding_a_Job/Titlepage_abstract_keywords.docx
@@ -96,17 +96,7 @@
           <w:sz w:val="24"/>
           <w:szCs w:val="24"/>
         </w:rPr>
-        <w:t>O</w:t>
-      </w:r>
-      <w:r>
-        <w:rPr>
-          <w:rFonts w:ascii="Times New Roman" w:eastAsia="Times New Roman" w:hAnsi="Times New Roman" w:cs="Times New Roman"/>
-          <w:i/>
-          <w:iCs/>
-          <w:sz w:val="24"/>
-          <w:szCs w:val="24"/>
-        </w:rPr>
-        <w:t>stensibly powerful predictors favored by segmented assimilation theory such as years of education and most aspects of English language proficiency were insignificant predictors in the final model. Refugee characteristics mattered in this analysis, but some of the ubiquitous and ostensibly powerful predictors of economic assimilation were insignificant predictors.</w:t>
+        <w:t>Ostensibly powerful predictors favored by segmented assimilation theory such as years of education and most aspects of English language proficiency were insignificant predictors in the final model. Refugee characteristics mattered in this analysis, but some of the ubiquitous and ostensibly powerful predictors of economic assimilation were insignificant predictors.</w:t>
       </w:r>
       <w:r>
         <w:rPr>
@@ -149,6 +139,22 @@
           <w:szCs w:val="24"/>
         </w:rPr>
       </w:pPr>
+      <w:r>
+        <w:rPr>
+          <w:rFonts w:ascii="Times New Roman" w:eastAsia="Times New Roman" w:hAnsi="Times New Roman" w:cs="Times New Roman"/>
+          <w:sz w:val="24"/>
+          <w:szCs w:val="24"/>
+        </w:rPr>
+        <w:t>Word count: 81</w:t>
+      </w:r>
+      <w:r>
+        <w:rPr>
+          <w:rFonts w:ascii="Times New Roman" w:eastAsia="Times New Roman" w:hAnsi="Times New Roman" w:cs="Times New Roman"/>
+          <w:sz w:val="24"/>
+          <w:szCs w:val="24"/>
+        </w:rPr>
+        <w:t>28</w:t>
+      </w:r>
     </w:p>
     <w:p/>
     <w:sectPr>

</xml_diff>